<commit_message>
chore: add the tabs, custom-styles, rtl, headers, toc, revisions, and native-objects fixtures
</commit_message>
<xml_diff>
--- a/tests/fixtures/pages/reference/everything.docx
+++ b/tests/fixtures/pages/reference/everything.docx
@@ -1442,9 +1442,8 @@
       <w:shd w:val="nil" w:color="auto" w:fill="auto"/>
       <w:vertAlign w:val="baseline"/>
       <w:lang w:val="en-US"/>
-      <w14:textOutline w14:w="12700" w14:cap="flat">
+      <w14:textOutline>
         <w14:noFill/>
-        <w14:miter w14:lim="400000"/>
       </w14:textOutline>
       <w14:textFill>
         <w14:solidFill>
@@ -2290,38 +2289,34 @@
         <a:spAutoFit/>
       </a:bodyPr>
       <a:lstStyle>
-        <a:defPPr marL="0" marR="0" indent="0" algn="ctr" defTabSz="914400" rtl="0" fontAlgn="auto" latinLnBrk="0" hangingPunct="0">
-          <a:lnSpc>
-            <a:spcPct val="107916"/>
-          </a:lnSpc>
-          <a:spcBef>
-            <a:spcPts val="800"/>
-          </a:spcBef>
-          <a:spcAft>
-            <a:spcPts val="0"/>
-          </a:spcAft>
-          <a:buClrTx/>
-          <a:buSzTx/>
-          <a:buFontTx/>
-          <a:buNone/>
-          <a:tabLst/>
-          <a:defRPr b="0" baseline="0" cap="none" i="1" spc="0" strike="noStrike" sz="900" u="none" kumimoji="0" normalizeH="0">
-            <a:ln>
-              <a:noFill/>
-            </a:ln>
-            <a:solidFill>
-              <a:srgbClr val="000000"/>
-            </a:solidFill>
-            <a:effectLst/>
-            <a:uFill>
-              <a:solidFill>
-                <a:srgbClr val="000000"/>
-              </a:solidFill>
-            </a:uFill>
-            <a:latin typeface="+mn-lt"/>
-            <a:ea typeface="+mn-ea"/>
-            <a:cs typeface="+mn-cs"/>
-            <a:sym typeface="Helvetica Neue"/>
+        <a:defPPr marL="0" marR="0" indent="0" algn="l" defTabSz="914400" rtl="0" fontAlgn="auto" latinLnBrk="0" hangingPunct="0">
+          <a:lnSpc>
+            <a:spcPct val="100000"/>
+          </a:lnSpc>
+          <a:spcBef>
+            <a:spcPts val="0"/>
+          </a:spcBef>
+          <a:spcAft>
+            <a:spcPts val="0"/>
+          </a:spcAft>
+          <a:buClrTx/>
+          <a:buSzTx/>
+          <a:buFontTx/>
+          <a:buNone/>
+          <a:tabLst/>
+          <a:defRPr b="0" baseline="0" cap="none" i="0" spc="0" strike="noStrike" sz="1800" u="none" kumimoji="0" normalizeH="0">
+            <a:ln>
+              <a:noFill/>
+            </a:ln>
+            <a:solidFill>
+              <a:srgbClr val="000000"/>
+            </a:solidFill>
+            <a:effectLst/>
+            <a:uFillTx/>
+            <a:latin typeface="Cambria"/>
+            <a:ea typeface="Cambria"/>
+            <a:cs typeface="Cambria"/>
+            <a:sym typeface="Cambria"/>
           </a:defRPr>
         </a:defPPr>
         <a:lvl1pPr marL="0" marR="0" indent="0" algn="l" defTabSz="914400" rtl="0" fontAlgn="auto" latinLnBrk="1" hangingPunct="0">

</xml_diff>

<commit_message>
chore: add the fields, metadata, alt-text, and dropcap fixtures
</commit_message>
<xml_diff>
--- a/tests/fixtures/pages/reference/everything.docx
+++ b/tests/fixtures/pages/reference/everything.docx
@@ -1442,8 +1442,9 @@
       <w:shd w:val="nil" w:color="auto" w:fill="auto"/>
       <w:vertAlign w:val="baseline"/>
       <w:lang w:val="en-US"/>
-      <w14:textOutline>
+      <w14:textOutline w14:w="12700" w14:cap="flat">
         <w14:noFill/>
+        <w14:miter w14:lim="400000"/>
       </w14:textOutline>
       <w14:textFill>
         <w14:solidFill>
@@ -2289,34 +2290,38 @@
         <a:spAutoFit/>
       </a:bodyPr>
       <a:lstStyle>
-        <a:defPPr marL="0" marR="0" indent="0" algn="l" defTabSz="914400" rtl="0" fontAlgn="auto" latinLnBrk="0" hangingPunct="0">
-          <a:lnSpc>
-            <a:spcPct val="100000"/>
-          </a:lnSpc>
-          <a:spcBef>
-            <a:spcPts val="0"/>
-          </a:spcBef>
-          <a:spcAft>
-            <a:spcPts val="0"/>
-          </a:spcAft>
-          <a:buClrTx/>
-          <a:buSzTx/>
-          <a:buFontTx/>
-          <a:buNone/>
-          <a:tabLst/>
-          <a:defRPr b="0" baseline="0" cap="none" i="0" spc="0" strike="noStrike" sz="1800" u="none" kumimoji="0" normalizeH="0">
-            <a:ln>
-              <a:noFill/>
-            </a:ln>
-            <a:solidFill>
-              <a:srgbClr val="000000"/>
-            </a:solidFill>
-            <a:effectLst/>
-            <a:uFillTx/>
-            <a:latin typeface="Cambria"/>
-            <a:ea typeface="Cambria"/>
-            <a:cs typeface="Cambria"/>
-            <a:sym typeface="Cambria"/>
+        <a:defPPr marL="0" marR="0" indent="0" algn="ctr" defTabSz="914400" rtl="0" fontAlgn="auto" latinLnBrk="0" hangingPunct="0">
+          <a:lnSpc>
+            <a:spcPct val="107916"/>
+          </a:lnSpc>
+          <a:spcBef>
+            <a:spcPts val="800"/>
+          </a:spcBef>
+          <a:spcAft>
+            <a:spcPts val="0"/>
+          </a:spcAft>
+          <a:buClrTx/>
+          <a:buSzTx/>
+          <a:buFontTx/>
+          <a:buNone/>
+          <a:tabLst/>
+          <a:defRPr b="0" baseline="0" cap="none" i="1" spc="0" strike="noStrike" sz="900" u="none" kumimoji="0" normalizeH="0">
+            <a:ln>
+              <a:noFill/>
+            </a:ln>
+            <a:solidFill>
+              <a:srgbClr val="000000"/>
+            </a:solidFill>
+            <a:effectLst/>
+            <a:uFill>
+              <a:solidFill>
+                <a:srgbClr val="000000"/>
+              </a:solidFill>
+            </a:uFill>
+            <a:latin typeface="+mn-lt"/>
+            <a:ea typeface="+mn-ea"/>
+            <a:cs typeface="+mn-cs"/>
+            <a:sym typeface="Helvetica Neue"/>
           </a:defRPr>
         </a:defPPr>
         <a:lvl1pPr marL="0" marR="0" indent="0" algn="l" defTabSz="914400" rtl="0" fontAlgn="auto" latinLnBrk="1" hangingPunct="0">

</xml_diff>